<commit_message>
docs: synchronize Q7 Other guidance
</commit_message>
<xml_diff>
--- a/docs/AI-Readiness-Assessment-Master-Reference.docx
+++ b/docs/AI-Readiness-Assessment-Master-Reference.docx
@@ -3526,7 +3526,7 @@
           <w:sz w:val="20"/>
           <w:szCs w:val="20"/>
         </w:rPr>
-        <w:t xml:space="preserve"> — skipping changes total points available. The one jump (Q7 → Q7b) targets an unscored Open Text question.</w:t>
+        <w:t xml:space="preserve"> — skipping changes total points available. Q7 uses ScoreApp's native Other option; if Task 11 shows that it does not capture free text, the fallback jump may target only the unscored Q7b Open Text question.</w:t>
       </w:r>
     </w:p>
     <w:p>
@@ -8931,7 +8931,7 @@
           <w:sz w:val="20"/>
           <w:szCs w:val="20"/>
         </w:rPr>
-        <w:t xml:space="preserve">Reporting &amp; data aggregation · Document creation &amp; review · Client or customer communications · Research &amp; analysis · Approval &amp; review processes · Employee or client onboarding · Sales operations &amp; CRM · Other — something else</w:t>
+        <w:t xml:space="preserve">Reporting &amp; data aggregation · Document creation &amp; review · Client or customer communications · Research &amp; analysis · Approval &amp; review processes · Employee or client onboarding · Sales operations &amp; CRM · Other</w:t>
       </w:r>
     </w:p>
     <w:p>

</xml_diff>

<commit_message>
docs: resolve Q7 review findings
</commit_message>
<xml_diff>
--- a/docs/AI-Readiness-Assessment-Master-Reference.docx
+++ b/docs/AI-Readiness-Assessment-Master-Reference.docx
@@ -9006,7 +9006,7 @@
           <w:sz w:val="21"/>
           <w:szCs w:val="21"/>
         </w:rPr>
-        <w:t xml:space="preserve">Q7b · Workflow Description</w:t>
+        <w:t xml:space="preserve">Q7b · Workflow Description · CONDITIONAL FALLBACK (NOT CURRENTLY BUILT)</w:t>
       </w:r>
     </w:p>
     <w:p>
@@ -9063,7 +9063,7 @@
           <w:sz w:val="20"/>
           <w:szCs w:val="20"/>
         </w:rPr>
-        <w:t xml:space="preserve">, shown by jump logic </w:t>
+        <w:t xml:space="preserve">. Create only if Task 11 confirms that ScoreApp's native Other option does not capture free text; if created, show by jump logic </w:t>
       </w:r>
       <w:r>
         <w:rPr>
@@ -9107,7 +9107,7 @@
           <w:sz w:val="20"/>
           <w:szCs w:val="20"/>
         </w:rPr>
-        <w:t xml:space="preserve">Safe to attach jump logic here precisely because it is unscored.</w:t>
+        <w:t xml:space="preserve">This fallback is safe to attach to jump logic precisely because it is unscored.</w:t>
       </w:r>
     </w:p>
     <w:p>

</xml_diff>